<commit_message>
Refine book layout: place Dedication and Foreword on their own dedicated pages across EN, DE, and Bilingual editions
</commit_message>
<xml_diff>
--- a/book/build/The_Conative_Integrative_Framework_Bilingual_Edition_Thomas_Riebl_6x9.docx
+++ b/book/build/The_Conative_Integrative_Framework_Bilingual_Edition_Thomas_Riebl_6x9.docx
@@ -109,27 +109,23 @@
       </w:r>
     </w:p>
     <w:bookmarkEnd w:id="10"/>
-    <w:bookmarkStart w:id="14" w:name="front-matter"/>
+    <w:bookmarkStart w:id="11" w:name="dedication"/>
     <w:p>
       <w:pPr>
         <w:pStyle w:val="Heading1"/>
       </w:pPr>
       <w:r>
-        <w:t xml:space="preserve">Front Matter</w:t>
-      </w:r>
-    </w:p>
-    <w:bookmarkStart w:id="11" w:name="dedication"/>
-    <w:p>
-      <w:pPr>
-        <w:pStyle w:val="Heading2"/>
-      </w:pPr>
-      <w:r>
         <w:t xml:space="preserve">Dedication</w:t>
       </w:r>
     </w:p>
     <w:p>
       <w:pPr>
         <w:pStyle w:val="FirstParagraph"/>
+      </w:pPr>
+    </w:p>
+    <w:p>
+      <w:pPr>
+        <w:pStyle w:val="BodyText"/>
       </w:pPr>
       <w:r>
         <w:rPr>
@@ -139,18 +135,11 @@
         <w:t xml:space="preserve">To all inquiring minds who recognize that consciousness is not an incidental byproduct of dead matter, but the fundamental ground of reality itself—and to those who strive to unite the mathematical rigor of science with the living depth of subjective interiority.</w:t>
       </w:r>
     </w:p>
-    <w:p>
-      <w:r>
-        <w:pict>
-          <v:rect style="width:0;height:1.5pt" o:hralign="center" o:hrstd="t" o:hr="t"/>
-        </w:pict>
-      </w:r>
-    </w:p>
     <w:bookmarkEnd w:id="11"/>
     <w:bookmarkStart w:id="12" w:name="authors-preface"/>
     <w:p>
       <w:pPr>
-        <w:pStyle w:val="Heading2"/>
+        <w:pStyle w:val="Heading1"/>
       </w:pPr>
       <w:r>
         <w:t xml:space="preserve">Author’s Preface</w:t>
@@ -704,6 +693,9 @@
         <w:pStyle w:val="BodyText"/>
       </w:pPr>
       <w:r>
+        <w:t xml:space="preserve"> </w:t>
+      </w:r>
+      <w:r>
         <w:rPr>
           <w:i/>
           <w:iCs/>
@@ -721,18 +713,11 @@
         <w:t xml:space="preserve">Luxembourg, September 2026</w:t>
       </w:r>
     </w:p>
-    <w:p>
-      <w:r>
-        <w:pict>
-          <v:rect style="width:0;height:1.5pt" o:hralign="center" o:hrstd="t" o:hr="t"/>
-        </w:pict>
-      </w:r>
-    </w:p>
     <w:bookmarkEnd w:id="12"/>
     <w:bookmarkStart w:id="13" w:name="X14c6aee3f68999a8fde73e04cf18273657e4879"/>
     <w:p>
       <w:pPr>
-        <w:pStyle w:val="Heading2"/>
+        <w:pStyle w:val="Heading1"/>
       </w:pPr>
       <w:r>
         <w:t xml:space="preserve">The Epistemological Manifesto: Beyond the Cogito</w:t>
@@ -934,8 +919,7 @@
       </w:r>
     </w:p>
     <w:bookmarkEnd w:id="13"/>
-    <w:bookmarkEnd w:id="14"/>
-    <w:bookmarkStart w:id="20" w:name="X9a48c9430623ff0b02dfd336833cb1e43af9c25"/>
+    <w:bookmarkStart w:id="19" w:name="X9a48c9430623ff0b02dfd336833cb1e43af9c25"/>
     <w:p>
       <w:pPr>
         <w:pStyle w:val="Heading1"/>
@@ -998,7 +982,7 @@
         </w:pict>
       </w:r>
     </w:p>
-    <w:bookmarkStart w:id="15" w:name="the-explanatory-chasm-of-physicalism"/>
+    <w:bookmarkStart w:id="14" w:name="the-explanatory-chasm-of-physicalism"/>
     <w:p>
       <w:pPr>
         <w:pStyle w:val="Heading2"/>
@@ -1257,8 +1241,8 @@
         </w:pict>
       </w:r>
     </w:p>
-    <w:bookmarkEnd w:id="15"/>
-    <w:bookmarkStart w:id="16" w:name="the-lineage-of-analytic-idealism"/>
+    <w:bookmarkEnd w:id="14"/>
+    <w:bookmarkStart w:id="15" w:name="the-lineage-of-analytic-idealism"/>
     <w:p>
       <w:pPr>
         <w:pStyle w:val="Heading2"/>
@@ -1660,8 +1644,8 @@
         </w:pict>
       </w:r>
     </w:p>
-    <w:bookmarkEnd w:id="16"/>
-    <w:bookmarkStart w:id="18" w:name="X1f83650c9ce82abe2579bc4eba37da51488ef95"/>
+    <w:bookmarkEnd w:id="15"/>
+    <w:bookmarkStart w:id="17" w:name="X1f83650c9ce82abe2579bc4eba37da51488ef95"/>
     <w:p>
       <w:pPr>
         <w:pStyle w:val="Heading2"/>
@@ -1740,7 +1724,7 @@
         <w:t xml:space="preserve">.</w:t>
       </w:r>
     </w:p>
-    <w:bookmarkStart w:id="17" w:name="X73aa4a8499a6b37bee4ccfddb0d288aa8ac5c4b"/>
+    <w:bookmarkStart w:id="16" w:name="X73aa4a8499a6b37bee4ccfddb0d288aa8ac5c4b"/>
     <w:p>
       <w:pPr>
         <w:pStyle w:val="Heading3"/>
@@ -2224,9 +2208,9 @@
         </w:pict>
       </w:r>
     </w:p>
+    <w:bookmarkEnd w:id="16"/>
     <w:bookmarkEnd w:id="17"/>
-    <w:bookmarkEnd w:id="18"/>
-    <w:bookmarkStart w:id="19" w:name="Xc1ed7c10fbe3f6a499abb9f7ba1b829fa518dc9"/>
+    <w:bookmarkStart w:id="18" w:name="Xc1ed7c10fbe3f6a499abb9f7ba1b829fa518dc9"/>
     <w:p>
       <w:pPr>
         <w:pStyle w:val="Heading2"/>
@@ -2305,9 +2289,9 @@
         <w:t xml:space="preserve">observed across its Markov Blanket. In the following chapter, we explore the exact cybernetic engine that enables this dissociated alter to preserve its existence: the Free Energy Principle and Active Inference.</w:t>
       </w:r>
     </w:p>
+    <w:bookmarkEnd w:id="18"/>
     <w:bookmarkEnd w:id="19"/>
-    <w:bookmarkEnd w:id="20"/>
-    <w:bookmarkStart w:id="26" w:name="X4d467fb6d27bbda50eabfe85a9d69efe5e7b2a6"/>
+    <w:bookmarkStart w:id="25" w:name="X4d467fb6d27bbda50eabfe85a9d69efe5e7b2a6"/>
     <w:p>
       <w:pPr>
         <w:pStyle w:val="Heading1"/>
@@ -2370,7 +2354,7 @@
         </w:pict>
       </w:r>
     </w:p>
-    <w:bookmarkStart w:id="21" w:name="Xa679afeac0139fa013c9cca3939a9f5dbbd2742"/>
+    <w:bookmarkStart w:id="20" w:name="Xa679afeac0139fa013c9cca3939a9f5dbbd2742"/>
     <w:p>
       <w:pPr>
         <w:pStyle w:val="Heading2"/>
@@ -2659,8 +2643,8 @@
         </w:pict>
       </w:r>
     </w:p>
-    <w:bookmarkEnd w:id="21"/>
-    <w:bookmarkStart w:id="22" w:name="X283c95f3cd0d3d5b54067cccab2a95a75398057"/>
+    <w:bookmarkEnd w:id="20"/>
+    <w:bookmarkStart w:id="21" w:name="X283c95f3cd0d3d5b54067cccab2a95a75398057"/>
     <w:p>
       <w:pPr>
         <w:pStyle w:val="Heading2"/>
@@ -3466,8 +3450,8 @@
         </w:pict>
       </w:r>
     </w:p>
-    <w:bookmarkEnd w:id="22"/>
-    <w:bookmarkStart w:id="23" w:name="Xc3e8763411ef8d49790182f823c3c624d3adcb6"/>
+    <w:bookmarkEnd w:id="21"/>
+    <w:bookmarkStart w:id="22" w:name="Xc3e8763411ef8d49790182f823c3c624d3adcb6"/>
     <w:p>
       <w:pPr>
         <w:pStyle w:val="Heading2"/>
@@ -4251,8 +4235,8 @@
         </w:pict>
       </w:r>
     </w:p>
-    <w:bookmarkEnd w:id="23"/>
-    <w:bookmarkStart w:id="25" w:name="X565c7663ec20afb99ebfe1188b1337a50937382"/>
+    <w:bookmarkEnd w:id="22"/>
+    <w:bookmarkStart w:id="24" w:name="X565c7663ec20afb99ebfe1188b1337a50937382"/>
     <w:p>
       <w:pPr>
         <w:pStyle w:val="Heading2"/>
@@ -4991,7 +4975,7 @@
         </m:oMath>
       </m:oMathPara>
     </w:p>
-    <w:bookmarkStart w:id="24" w:name="X214d0bcfccfae31b3203590410c1355f16cadd0"/>
+    <w:bookmarkStart w:id="23" w:name="X214d0bcfccfae31b3203590410c1355f16cadd0"/>
     <w:p>
       <w:pPr>
         <w:pStyle w:val="Heading3"/>
@@ -5329,10 +5313,10 @@
         <w:t xml:space="preserve">In the next chapter, we transition from this 3rd-person cybernetic description to the 1st-person interiority of consciousness: Giulio Tononi’s Integrated Information Theory (IIT 4.0) and the discovery of the 6th Axiom.</w:t>
       </w:r>
     </w:p>
+    <w:bookmarkEnd w:id="23"/>
     <w:bookmarkEnd w:id="24"/>
     <w:bookmarkEnd w:id="25"/>
-    <w:bookmarkEnd w:id="26"/>
-    <w:bookmarkStart w:id="35" w:name="X1fb220278f0983fea7058f819177ce75260a346"/>
+    <w:bookmarkStart w:id="34" w:name="X1fb220278f0983fea7058f819177ce75260a346"/>
     <w:p>
       <w:pPr>
         <w:pStyle w:val="Heading1"/>
@@ -5395,7 +5379,7 @@
         </w:pict>
       </w:r>
     </w:p>
-    <w:bookmarkStart w:id="28" w:name="the-axiomatic-approach-of-iit-4.0"/>
+    <w:bookmarkStart w:id="27" w:name="the-axiomatic-approach-of-iit-4.0"/>
     <w:p>
       <w:pPr>
         <w:pStyle w:val="Heading2"/>
@@ -5491,7 +5475,7 @@
         <w:t xml:space="preserve">).</w:t>
       </w:r>
     </w:p>
-    <w:bookmarkStart w:id="27" w:name="the-five-foundational-axioms-of-iit-4.0"/>
+    <w:bookmarkStart w:id="26" w:name="the-five-foundational-axioms-of-iit-4.0"/>
     <w:p>
       <w:pPr>
         <w:pStyle w:val="Heading3"/>
@@ -5676,9 +5660,9 @@
         </w:pict>
       </w:r>
     </w:p>
+    <w:bookmarkEnd w:id="26"/>
     <w:bookmarkEnd w:id="27"/>
-    <w:bookmarkEnd w:id="28"/>
-    <w:bookmarkStart w:id="29" w:name="quantifying-integrated-causal-power-phi"/>
+    <w:bookmarkStart w:id="28" w:name="quantifying-integrated-causal-power-phi"/>
     <w:p>
       <w:pPr>
         <w:pStyle w:val="Heading2"/>
@@ -6471,8 +6455,8 @@
         </w:pict>
       </w:r>
     </w:p>
-    <w:bookmarkEnd w:id="29"/>
-    <w:bookmarkStart w:id="30" w:name="Xb747bc608eda8566f705f2dcb1898021da1c3a7"/>
+    <w:bookmarkEnd w:id="28"/>
+    <w:bookmarkStart w:id="29" w:name="Xb747bc608eda8566f705f2dcb1898021da1c3a7"/>
     <w:p>
       <w:pPr>
         <w:pStyle w:val="Heading2"/>
@@ -6636,8 +6620,8 @@
         </w:pict>
       </w:r>
     </w:p>
-    <w:bookmarkEnd w:id="30"/>
-    <w:bookmarkStart w:id="34" w:name="X1c657d2316ee51f85c494e4fac1e94306cdee07"/>
+    <w:bookmarkEnd w:id="29"/>
+    <w:bookmarkStart w:id="33" w:name="X1c657d2316ee51f85c494e4fac1e94306cdee07"/>
     <w:p>
       <w:pPr>
         <w:pStyle w:val="Heading2"/>
@@ -6686,7 +6670,7 @@
         <w:t xml:space="preserve">in the Conative-Integrative Framework:</w:t>
       </w:r>
     </w:p>
-    <w:bookmarkStart w:id="31" w:name="the-6th-axiom-phenomenological-level"/>
+    <w:bookmarkStart w:id="30" w:name="the-6th-axiom-phenomenological-level"/>
     <w:p>
       <w:pPr>
         <w:pStyle w:val="Heading3"/>
@@ -6717,8 +6701,8 @@
         <w:t xml:space="preserve">Subjective consciousness is intrinsically temporal and autopoietic; it manifests as an active, continuous striving of the conscious alter to maintain its own unified existence and resist annihilation across time.</w:t>
       </w:r>
     </w:p>
-    <w:bookmarkEnd w:id="31"/>
-    <w:bookmarkStart w:id="32" w:name="the-6th-postulate-physicalcausal-level"/>
+    <w:bookmarkEnd w:id="30"/>
+    <w:bookmarkStart w:id="31" w:name="the-6th-postulate-physicalcausal-level"/>
     <w:p>
       <w:pPr>
         <w:pStyle w:val="Heading3"/>
@@ -6947,8 +6931,8 @@
         <w:t xml:space="preserve">is the optimal policy selected by the agent’s generative model.</w:t>
       </w:r>
     </w:p>
-    <w:bookmarkEnd w:id="32"/>
-    <w:bookmarkStart w:id="33" w:name="theoretical-significance"/>
+    <w:bookmarkEnd w:id="31"/>
+    <w:bookmarkStart w:id="32" w:name="theoretical-significance"/>
     <w:p>
       <w:pPr>
         <w:pStyle w:val="Heading3"/>
@@ -7126,10 +7110,10 @@
         <w:t xml:space="preserve">In the next chapter, we prove the fundamental mathematical equivalence connecting the 6th Axiom with Active Inference.</w:t>
       </w:r>
     </w:p>
+    <w:bookmarkEnd w:id="32"/>
     <w:bookmarkEnd w:id="33"/>
     <w:bookmarkEnd w:id="34"/>
-    <w:bookmarkEnd w:id="35"/>
-    <w:bookmarkStart w:id="45" w:name="Xb1ed3b0c566a06466f1f8a89b9b24014f21d521"/>
+    <w:bookmarkStart w:id="44" w:name="Xb1ed3b0c566a06466f1f8a89b9b24014f21d521"/>
     <w:p>
       <w:pPr>
         <w:pStyle w:val="Heading1"/>
@@ -7192,7 +7176,7 @@
         </w:pict>
       </w:r>
     </w:p>
-    <w:bookmarkStart w:id="37" w:name="the-master-bridging-equivalence"/>
+    <w:bookmarkStart w:id="36" w:name="the-master-bridging-equivalence"/>
     <w:p>
       <w:pPr>
         <w:pStyle w:val="Heading2"/>
@@ -7710,7 +7694,7 @@
         <w:t xml:space="preserve">    end</w:t>
       </w:r>
     </w:p>
-    <w:bookmarkStart w:id="36" w:name="interpretation"/>
+    <w:bookmarkStart w:id="35" w:name="interpretation"/>
     <w:p>
       <w:pPr>
         <w:pStyle w:val="Heading3"/>
@@ -7851,9 +7835,9 @@
         </w:pict>
       </w:r>
     </w:p>
+    <w:bookmarkEnd w:id="35"/>
     <w:bookmarkEnd w:id="36"/>
-    <w:bookmarkEnd w:id="37"/>
-    <w:bookmarkStart w:id="42" w:name="formal-derivation-of-the-bridge"/>
+    <w:bookmarkStart w:id="41" w:name="formal-derivation-of-the-bridge"/>
     <w:p>
       <w:pPr>
         <w:pStyle w:val="Heading2"/>
@@ -7967,7 +7951,7 @@
         <w:t xml:space="preserve">:</w:t>
       </w:r>
     </w:p>
-    <w:bookmarkStart w:id="38" w:name="X15a78c44b79cfcb34c500a4acf2bfd3dffe475f"/>
+    <w:bookmarkStart w:id="37" w:name="X15a78c44b79cfcb34c500a4acf2bfd3dffe475f"/>
     <w:p>
       <w:pPr>
         <w:pStyle w:val="Heading3"/>
@@ -8233,8 +8217,8 @@
         <w:t xml:space="preserve">increases.</w:t>
       </w:r>
     </w:p>
-    <w:bookmarkEnd w:id="38"/>
-    <w:bookmarkStart w:id="39" w:name="X6fce7605ace1436ff2d575749d36892fc5bf160"/>
+    <w:bookmarkEnd w:id="37"/>
+    <w:bookmarkStart w:id="38" w:name="X6fce7605ace1436ff2d575749d36892fc5bf160"/>
     <w:p>
       <w:pPr>
         <w:pStyle w:val="Heading3"/>
@@ -8543,8 +8527,8 @@
         <w:t xml:space="preserve">under structural collapse.</w:t>
       </w:r>
     </w:p>
-    <w:bookmarkEnd w:id="39"/>
-    <w:bookmarkStart w:id="41" w:name="theorem-autopoietic-phi-persistence"/>
+    <w:bookmarkEnd w:id="38"/>
+    <w:bookmarkStart w:id="40" w:name="theorem-autopoietic-phi-persistence"/>
     <w:p>
       <w:pPr>
         <w:pStyle w:val="Heading3"/>
@@ -9026,7 +9010,7 @@
         </m:oMath>
       </m:oMathPara>
     </w:p>
-    <w:bookmarkStart w:id="40" w:name="proof-sketch"/>
+    <w:bookmarkStart w:id="39" w:name="proof-sketch"/>
     <w:p>
       <w:pPr>
         <w:pStyle w:val="Heading4"/>
@@ -9965,10 +9949,10 @@
         </w:pict>
       </w:r>
     </w:p>
+    <w:bookmarkEnd w:id="39"/>
     <w:bookmarkEnd w:id="40"/>
     <w:bookmarkEnd w:id="41"/>
-    <w:bookmarkEnd w:id="42"/>
-    <w:bookmarkStart w:id="43" w:name="X5fb263508b1a4d31332f23da48b5fadbc2f2ec8"/>
+    <w:bookmarkStart w:id="42" w:name="X5fb263508b1a4d31332f23da48b5fadbc2f2ec8"/>
     <w:p>
       <w:pPr>
         <w:pStyle w:val="Heading2"/>
@@ -10291,8 +10275,8 @@
         </w:pict>
       </w:r>
     </w:p>
-    <w:bookmarkEnd w:id="43"/>
-    <w:bookmarkStart w:id="44" w:name="Xa57cca0d89bb55a423b387457111e8fcf68de7c"/>
+    <w:bookmarkEnd w:id="42"/>
+    <w:bookmarkStart w:id="43" w:name="Xa57cca0d89bb55a423b387457111e8fcf68de7c"/>
     <w:p>
       <w:pPr>
         <w:pStyle w:val="Heading2"/>
@@ -10516,9 +10500,9 @@
         <w:t xml:space="preserve">What is an individual soul?</w:t>
       </w:r>
     </w:p>
+    <w:bookmarkEnd w:id="43"/>
     <w:bookmarkEnd w:id="44"/>
-    <w:bookmarkEnd w:id="45"/>
-    <w:bookmarkStart w:id="56" w:name="X1ebf0735a166f9c29f4ce211a0c7660f93ced86"/>
+    <w:bookmarkStart w:id="55" w:name="X1ebf0735a166f9c29f4ce211a0c7660f93ced86"/>
     <w:p>
       <w:pPr>
         <w:pStyle w:val="Heading1"/>
@@ -10581,7 +10565,7 @@
         </w:pict>
       </w:r>
     </w:p>
-    <w:bookmarkStart w:id="46" w:name="X1e3b868cbd079b9855d063dea05574985f3f355"/>
+    <w:bookmarkStart w:id="45" w:name="X1e3b868cbd079b9855d063dea05574985f3f355"/>
     <w:p>
       <w:pPr>
         <w:pStyle w:val="Heading2"/>
@@ -10792,8 +10776,8 @@
         </w:pict>
       </w:r>
     </w:p>
-    <w:bookmarkEnd w:id="46"/>
-    <w:bookmarkStart w:id="53" w:name="the-six-architectural-layers-of-the-soul"/>
+    <w:bookmarkEnd w:id="45"/>
+    <w:bookmarkStart w:id="52" w:name="the-six-architectural-layers-of-the-soul"/>
     <w:p>
       <w:pPr>
         <w:pStyle w:val="Heading2"/>
@@ -10802,7 +10786,7 @@
         <w:t xml:space="preserve">5.2 The Six Architectural Layers of the Soul</w:t>
       </w:r>
     </w:p>
-    <w:bookmarkStart w:id="47" w:name="Xa5ce5a01e0231d84e475764039a9fb3603e0c10"/>
+    <w:bookmarkStart w:id="46" w:name="Xa5ce5a01e0231d84e475764039a9fb3603e0c10"/>
     <w:p>
       <w:pPr>
         <w:pStyle w:val="Heading3"/>
@@ -10872,8 +10856,8 @@
         <w:t xml:space="preserve">), the transpersonal ground of existence, and the ultimate container into which localized awareness dissolves upon biological death.</w:t>
       </w:r>
     </w:p>
-    <w:bookmarkEnd w:id="47"/>
-    <w:bookmarkStart w:id="48" w:name="X6b3b77b9a6833934ee553e7db291664efdf1bbd"/>
+    <w:bookmarkEnd w:id="46"/>
+    <w:bookmarkStart w:id="47" w:name="X6b3b77b9a6833934ee553e7db291664efdf1bbd"/>
     <w:p>
       <w:pPr>
         <w:pStyle w:val="Heading3"/>
@@ -10961,8 +10945,8 @@
         <w:t xml:space="preserve">* This hardware constitutes the immutable phylogenetic baseline that constrains all downstream cognitive development.</w:t>
       </w:r>
     </w:p>
-    <w:bookmarkEnd w:id="48"/>
-    <w:bookmarkStart w:id="49" w:name="X4111c2005ce0de55f34270ce69f56c54e891467"/>
+    <w:bookmarkEnd w:id="47"/>
+    <w:bookmarkStart w:id="48" w:name="X4111c2005ce0de55f34270ce69f56c54e891467"/>
     <w:p>
       <w:pPr>
         <w:pStyle w:val="Heading3"/>
@@ -11093,8 +11077,8 @@
         <w:t xml:space="preserve">identical genomes diverge prenatally in brain micro-connectivity due to developmental fluctuations, ensuring that every individual soul possesses an irreducibly unique somatic wiring.</w:t>
       </w:r>
     </w:p>
-    <w:bookmarkEnd w:id="49"/>
-    <w:bookmarkStart w:id="50" w:name="Xe8fe240e2ffcdfced1d0228452e34acfb7ab8a7"/>
+    <w:bookmarkEnd w:id="48"/>
+    <w:bookmarkStart w:id="49" w:name="Xe8fe240e2ffcdfced1d0228452e34acfb7ab8a7"/>
     <w:p>
       <w:pPr>
         <w:pStyle w:val="Heading3"/>
@@ -11179,8 +11163,8 @@
         <w:t xml:space="preserve">* Epigenetics acts as a transgenerational bridge, calibrating the offspring’s sensory and emotional sensitivity before personal life experience begins.</w:t>
       </w:r>
     </w:p>
-    <w:bookmarkEnd w:id="50"/>
-    <w:bookmarkStart w:id="51" w:name="X1c2ef8f72f91a142a12be7a65105926ee0af1b2"/>
+    <w:bookmarkEnd w:id="49"/>
+    <w:bookmarkStart w:id="50" w:name="X1c2ef8f72f91a142a12be7a65105926ee0af1b2"/>
     <w:p>
       <w:pPr>
         <w:pStyle w:val="Heading3"/>
@@ -11274,8 +11258,8 @@
         <w:t xml:space="preserve">of the psyche—the explicit memories, moral convictions, and cognitive models that distinguish one person’s life history from another.</w:t>
       </w:r>
     </w:p>
-    <w:bookmarkEnd w:id="51"/>
-    <w:bookmarkStart w:id="52" w:name="X21641fdb145a832d1ec094e39f2650318ac6479"/>
+    <w:bookmarkEnd w:id="50"/>
+    <w:bookmarkStart w:id="51" w:name="X21641fdb145a832d1ec094e39f2650318ac6479"/>
     <w:p>
       <w:pPr>
         <w:pStyle w:val="Heading3"/>
@@ -11430,9 +11414,9 @@
         </w:pict>
       </w:r>
     </w:p>
+    <w:bookmarkEnd w:id="51"/>
     <w:bookmarkEnd w:id="52"/>
-    <w:bookmarkEnd w:id="53"/>
-    <w:bookmarkStart w:id="55" w:name="X489b1885119d464027b4be96cd4649ee52b260e"/>
+    <w:bookmarkStart w:id="54" w:name="X489b1885119d464027b4be96cd4649ee52b260e"/>
     <w:p>
       <w:pPr>
         <w:pStyle w:val="Heading2"/>
@@ -12440,7 +12424,7 @@
         </w:tc>
       </w:tr>
     </w:tbl>
-    <w:bookmarkStart w:id="54" w:name="Xe15cf1996ff465f520c52a5ac64ef93de37cac4"/>
+    <w:bookmarkStart w:id="53" w:name="Xe15cf1996ff465f520c52a5ac64ef93de37cac4"/>
     <w:p>
       <w:pPr>
         <w:pStyle w:val="Heading3"/>
@@ -12499,10 +12483,10 @@
         <w:t xml:space="preserve">.</w:t>
       </w:r>
     </w:p>
+    <w:bookmarkEnd w:id="53"/>
     <w:bookmarkEnd w:id="54"/>
     <w:bookmarkEnd w:id="55"/>
-    <w:bookmarkEnd w:id="56"/>
-    <w:bookmarkStart w:id="63" w:name="X935a624217c1807694fe6cf29be60939f66e76f"/>
+    <w:bookmarkStart w:id="62" w:name="X935a624217c1807694fe6cf29be60939f66e76f"/>
     <w:p>
       <w:pPr>
         <w:pStyle w:val="Heading1"/>
@@ -12565,7 +12549,7 @@
         </w:pict>
       </w:r>
     </w:p>
-    <w:bookmarkStart w:id="57" w:name="X8fb41a54fefae3bc42894478ab25db870294895"/>
+    <w:bookmarkStart w:id="56" w:name="X8fb41a54fefae3bc42894478ab25db870294895"/>
     <w:p>
       <w:pPr>
         <w:pStyle w:val="Heading2"/>
@@ -12744,8 +12728,8 @@
         </w:pict>
       </w:r>
     </w:p>
-    <w:bookmarkEnd w:id="57"/>
-    <w:bookmarkStart w:id="58" w:name="husserls-triad-and-the-predictive-brain"/>
+    <w:bookmarkEnd w:id="56"/>
+    <w:bookmarkStart w:id="57" w:name="husserls-triad-and-the-predictive-brain"/>
     <w:p>
       <w:pPr>
         <w:pStyle w:val="Heading2"/>
@@ -13166,8 +13150,8 @@
         </w:pict>
       </w:r>
     </w:p>
-    <w:bookmarkEnd w:id="58"/>
-    <w:bookmarkStart w:id="61" w:name="X54d83fb1b2afd8bd60b4191cf33936888d2f69b"/>
+    <w:bookmarkEnd w:id="57"/>
+    <w:bookmarkStart w:id="60" w:name="X54d83fb1b2afd8bd60b4191cf33936888d2f69b"/>
     <w:p>
       <w:pPr>
         <w:pStyle w:val="Heading2"/>
@@ -13335,7 +13319,7 @@
         <w:t xml:space="preserve">In the Conative-Integrative Framework, we formalize this structural requirement as an explicit mathematical theorem:</w:t>
       </w:r>
     </w:p>
-    <w:bookmarkStart w:id="60" w:name="the-theorem-of-minimum-temporal-depth"/>
+    <w:bookmarkStart w:id="59" w:name="the-theorem-of-minimum-temporal-depth"/>
     <w:p>
       <w:pPr>
         <w:pStyle w:val="Heading3"/>
@@ -13474,7 +13458,7 @@
         <w:rPr>
           <w:rStyle w:val="FootnoteReference"/>
         </w:rPr>
-        <w:footnoteReference w:id="59"/>
+        <w:footnoteReference w:id="58"/>
       </w:r>
     </w:p>
     <w:p>
@@ -13484,9 +13468,9 @@
         </w:pict>
       </w:r>
     </w:p>
+    <w:bookmarkEnd w:id="59"/>
     <w:bookmarkEnd w:id="60"/>
-    <w:bookmarkEnd w:id="61"/>
-    <w:bookmarkStart w:id="62" w:name="X2b7bb54d44c1826c5136beb345bce251f29d4de"/>
+    <w:bookmarkStart w:id="61" w:name="X2b7bb54d44c1826c5136beb345bce251f29d4de"/>
     <w:p>
       <w:pPr>
         <w:pStyle w:val="Heading2"/>
@@ -13821,9 +13805,9 @@
         <w:t xml:space="preserve">In the next chapter, we verify these theoretical principles through rigorous computational simulations using Monte Carlo ensemble sampling.</w:t>
       </w:r>
     </w:p>
+    <w:bookmarkEnd w:id="61"/>
     <w:bookmarkEnd w:id="62"/>
-    <w:bookmarkEnd w:id="63"/>
-    <w:bookmarkStart w:id="72" w:name="X7041a255e637536b7cbd3765a28f8cbba790902"/>
+    <w:bookmarkStart w:id="71" w:name="X7041a255e637536b7cbd3765a28f8cbba790902"/>
     <w:p>
       <w:pPr>
         <w:pStyle w:val="Heading1"/>
@@ -13886,7 +13870,7 @@
         </w:pict>
       </w:r>
     </w:p>
-    <w:bookmarkStart w:id="64" w:name="X5d17e027b64d4c95896e716984102b27174bb36"/>
+    <w:bookmarkStart w:id="63" w:name="X5d17e027b64d4c95896e716984102b27174bb36"/>
     <w:p>
       <w:pPr>
         <w:pStyle w:val="Heading2"/>
@@ -14073,8 +14057,8 @@
         </w:pict>
       </w:r>
     </w:p>
-    <w:bookmarkEnd w:id="64"/>
-    <w:bookmarkStart w:id="66" w:name="the-simulation-environment-architecture"/>
+    <w:bookmarkEnd w:id="63"/>
+    <w:bookmarkStart w:id="65" w:name="the-simulation-environment-architecture"/>
     <w:p>
       <w:pPr>
         <w:pStyle w:val="Heading2"/>
@@ -14318,7 +14302,7 @@
         <w:t xml:space="preserve">    end</w:t>
       </w:r>
     </w:p>
-    <w:bookmarkStart w:id="65" w:name="the-four-tested-cohorts"/>
+    <w:bookmarkStart w:id="64" w:name="the-four-tested-cohorts"/>
     <w:p>
       <w:pPr>
         <w:pStyle w:val="Heading3"/>
@@ -14621,9 +14605,9 @@
         </w:pict>
       </w:r>
     </w:p>
+    <w:bookmarkEnd w:id="64"/>
     <w:bookmarkEnd w:id="65"/>
-    <w:bookmarkEnd w:id="66"/>
-    <w:bookmarkStart w:id="67" w:name="monte-carlo-ensemble-methodology"/>
+    <w:bookmarkStart w:id="66" w:name="monte-carlo-ensemble-methodology"/>
     <w:p>
       <w:pPr>
         <w:pStyle w:val="Heading2"/>
@@ -15069,8 +15053,8 @@
         </w:pict>
       </w:r>
     </w:p>
-    <w:bookmarkEnd w:id="67"/>
-    <w:bookmarkStart w:id="68" w:name="quantitative-results-empirical-findings"/>
+    <w:bookmarkEnd w:id="66"/>
+    <w:bookmarkStart w:id="67" w:name="quantitative-results-empirical-findings"/>
     <w:p>
       <w:pPr>
         <w:pStyle w:val="Heading2"/>
@@ -15859,8 +15843,8 @@
         </w:pict>
       </w:r>
     </w:p>
-    <w:bookmarkEnd w:id="68"/>
-    <w:bookmarkStart w:id="71" w:name="X8523eaa1206fc3e12f9837d6277136c39baf509"/>
+    <w:bookmarkEnd w:id="67"/>
+    <w:bookmarkStart w:id="70" w:name="X8523eaa1206fc3e12f9837d6277136c39baf509"/>
     <w:p>
       <w:pPr>
         <w:pStyle w:val="Heading2"/>
@@ -15902,7 +15886,7 @@
         <w:t xml:space="preserve">Deep Temporal Active Inference Simulation Results</w:t>
       </w:r>
     </w:p>
-    <w:bookmarkStart w:id="69" w:name="analysis-of-the-4-panel-results"/>
+    <w:bookmarkStart w:id="68" w:name="analysis-of-the-4-panel-results"/>
     <w:p>
       <w:pPr>
         <w:pStyle w:val="Heading3"/>
@@ -16377,62 +16361,62 @@
         <w:t xml:space="preserve">to eliminate sensory ambiguity before navigating safely to the goal.</w:t>
       </w:r>
     </w:p>
+    <w:bookmarkEnd w:id="68"/>
+    <w:bookmarkStart w:id="69" w:name="conclusion"/>
+    <w:p>
+      <w:pPr>
+        <w:pStyle w:val="Heading3"/>
+      </w:pPr>
+      <w:r>
+        <w:t xml:space="preserve">Conclusion:</w:t>
+      </w:r>
+    </w:p>
+    <w:p>
+      <w:pPr>
+        <w:pStyle w:val="FirstParagraph"/>
+      </w:pPr>
+      <w:r>
+        <w:t xml:space="preserve">These simulations provide formal computational proof for the</w:t>
+      </w:r>
+      <w:r>
+        <w:t xml:space="preserve"> </w:t>
+      </w:r>
+      <w:r>
+        <w:rPr>
+          <w:b/>
+          <w:bCs/>
+        </w:rPr>
+        <w:t xml:space="preserve">Theorem of Minimum Temporal Depth (</w:t>
+      </w:r>
+      <m:oMath>
+        <m:r>
+          <m:t>H</m:t>
+        </m:r>
+        <m:r>
+          <m:rPr>
+            <m:sty m:val="p"/>
+          </m:rPr>
+          <m:t>&gt;</m:t>
+        </m:r>
+        <m:r>
+          <m:t>1</m:t>
+        </m:r>
+      </m:oMath>
+      <w:r>
+        <w:rPr>
+          <w:b/>
+          <w:bCs/>
+        </w:rPr>
+        <w:t xml:space="preserve">)</w:t>
+      </w:r>
+      <w:r>
+        <w:t xml:space="preserve">: conscious agency is not an abstract metaphysical luxury, but an indispensable mathematical mechanism for biological survival and the preservation of integrated causal power.</w:t>
+      </w:r>
+    </w:p>
     <w:bookmarkEnd w:id="69"/>
-    <w:bookmarkStart w:id="70" w:name="conclusion"/>
-    <w:p>
-      <w:pPr>
-        <w:pStyle w:val="Heading3"/>
-      </w:pPr>
-      <w:r>
-        <w:t xml:space="preserve">Conclusion:</w:t>
-      </w:r>
-    </w:p>
-    <w:p>
-      <w:pPr>
-        <w:pStyle w:val="FirstParagraph"/>
-      </w:pPr>
-      <w:r>
-        <w:t xml:space="preserve">These simulations provide formal computational proof for the</w:t>
-      </w:r>
-      <w:r>
-        <w:t xml:space="preserve"> </w:t>
-      </w:r>
-      <w:r>
-        <w:rPr>
-          <w:b/>
-          <w:bCs/>
-        </w:rPr>
-        <w:t xml:space="preserve">Theorem of Minimum Temporal Depth (</w:t>
-      </w:r>
-      <m:oMath>
-        <m:r>
-          <m:t>H</m:t>
-        </m:r>
-        <m:r>
-          <m:rPr>
-            <m:sty m:val="p"/>
-          </m:rPr>
-          <m:t>&gt;</m:t>
-        </m:r>
-        <m:r>
-          <m:t>1</m:t>
-        </m:r>
-      </m:oMath>
-      <w:r>
-        <w:rPr>
-          <w:b/>
-          <w:bCs/>
-        </w:rPr>
-        <w:t xml:space="preserve">)</w:t>
-      </w:r>
-      <w:r>
-        <w:t xml:space="preserve">: conscious agency is not an abstract metaphysical luxury, but an indispensable mathematical mechanism for biological survival and the preservation of integrated causal power.</w:t>
-      </w:r>
-    </w:p>
     <w:bookmarkEnd w:id="70"/>
     <w:bookmarkEnd w:id="71"/>
-    <w:bookmarkEnd w:id="72"/>
-    <w:bookmarkStart w:id="78" w:name="X11192686147c7e58a443d2dfb5c32e11f86e80c"/>
+    <w:bookmarkStart w:id="77" w:name="X11192686147c7e58a443d2dfb5c32e11f86e80c"/>
     <w:p>
       <w:pPr>
         <w:pStyle w:val="Heading1"/>
@@ -16495,7 +16479,7 @@
         </w:pict>
       </w:r>
     </w:p>
-    <w:bookmarkStart w:id="73" w:name="the-cosmic-purpose-of-dissociation"/>
+    <w:bookmarkStart w:id="72" w:name="the-cosmic-purpose-of-dissociation"/>
     <w:p>
       <w:pPr>
         <w:pStyle w:val="Heading2"/>
@@ -16593,8 +16577,8 @@
         </w:pict>
       </w:r>
     </w:p>
-    <w:bookmarkEnd w:id="73"/>
-    <w:bookmarkStart w:id="74" w:name="Xf1c004067f35d4e6f297f57cc0190cdcfcf8d5e"/>
+    <w:bookmarkEnd w:id="72"/>
+    <w:bookmarkStart w:id="73" w:name="Xf1c004067f35d4e6f297f57cc0190cdcfcf8d5e"/>
     <w:p>
       <w:pPr>
         <w:pStyle w:val="Heading2"/>
@@ -17045,8 +17029,8 @@
         </w:pict>
       </w:r>
     </w:p>
-    <w:bookmarkEnd w:id="74"/>
-    <w:bookmarkStart w:id="75" w:name="X2263d3a55abdab90c513142e944be7a01586e2d"/>
+    <w:bookmarkEnd w:id="73"/>
+    <w:bookmarkStart w:id="74" w:name="X2263d3a55abdab90c513142e944be7a01586e2d"/>
     <w:p>
       <w:pPr>
         <w:pStyle w:val="Heading2"/>
@@ -17166,8 +17150,8 @@
         </w:pict>
       </w:r>
     </w:p>
-    <w:bookmarkEnd w:id="75"/>
-    <w:bookmarkStart w:id="77" w:name="X18323c4665b77ef7fdb168dd57a337fa00135b1"/>
+    <w:bookmarkEnd w:id="74"/>
+    <w:bookmarkStart w:id="76" w:name="X18323c4665b77ef7fdb168dd57a337fa00135b1"/>
     <w:p>
       <w:pPr>
         <w:pStyle w:val="Heading2"/>
@@ -17436,7 +17420,7 @@
         <w:t xml:space="preserve">    end</w:t>
       </w:r>
     </w:p>
-    <w:bookmarkStart w:id="76" w:name="X5b46fb41c15d53f75183497b38c8317e16788c1"/>
+    <w:bookmarkStart w:id="75" w:name="X5b46fb41c15d53f75183497b38c8317e16788c1"/>
     <w:p>
       <w:pPr>
         <w:pStyle w:val="Heading3"/>
@@ -17696,10 +17680,10 @@
         <w:t xml:space="preserve">In the final chapter, we provide the mathematical appendices, source codes, and complete bibliography concluding this treatise.</w:t>
       </w:r>
     </w:p>
+    <w:bookmarkEnd w:id="75"/>
     <w:bookmarkEnd w:id="76"/>
     <w:bookmarkEnd w:id="77"/>
-    <w:bookmarkEnd w:id="78"/>
-    <w:bookmarkStart w:id="87" w:name="X7675127ffb4ba549054e43433f1590e220287b6"/>
+    <w:bookmarkStart w:id="86" w:name="X7675127ffb4ba549054e43433f1590e220287b6"/>
     <w:p>
       <w:pPr>
         <w:pStyle w:val="Heading1"/>
@@ -17715,7 +17699,7 @@
         </w:pict>
       </w:r>
     </w:p>
-    <w:bookmarkStart w:id="83" w:name="X6b39e7f790055e8bd1a052241d000c4450668b5"/>
+    <w:bookmarkStart w:id="82" w:name="X6b39e7f790055e8bd1a052241d000c4450668b5"/>
     <w:p>
       <w:pPr>
         <w:pStyle w:val="Heading2"/>
@@ -17724,7 +17708,7 @@
         <w:t xml:space="preserve">Appendix A: Mathematical Formalisms &amp; Tensor Notations</w:t>
       </w:r>
     </w:p>
-    <w:bookmarkStart w:id="79" w:name="the-pomdp-generative-model"/>
+    <w:bookmarkStart w:id="78" w:name="the-pomdp-generative-model"/>
     <w:p>
       <w:pPr>
         <w:pStyle w:val="Heading3"/>
@@ -18852,8 +18836,8 @@
         <w:t xml:space="preserve">Inverse temperature governing policy selection certainty.</w:t>
       </w:r>
     </w:p>
-    <w:bookmarkEnd w:id="79"/>
-    <w:bookmarkStart w:id="80" w:name="Xeaa958649ca166d896f349157c8e63422a079a4"/>
+    <w:bookmarkEnd w:id="78"/>
+    <w:bookmarkStart w:id="79" w:name="Xeaa958649ca166d896f349157c8e63422a079a4"/>
     <w:p>
       <w:pPr>
         <w:pStyle w:val="Heading3"/>
@@ -19277,8 +19261,8 @@
         <w:t xml:space="preserve">is the softmax function.</w:t>
       </w:r>
     </w:p>
-    <w:bookmarkEnd w:id="80"/>
-    <w:bookmarkStart w:id="81" w:name="Xe2c2d8f3e08a3dfcb1f1671d1723251c9362e6b"/>
+    <w:bookmarkEnd w:id="79"/>
+    <w:bookmarkStart w:id="80" w:name="Xe2c2d8f3e08a3dfcb1f1671d1723251c9362e6b"/>
     <w:p>
       <w:pPr>
         <w:pStyle w:val="Heading3"/>
@@ -20202,8 +20186,8 @@
         </m:oMath>
       </m:oMathPara>
     </w:p>
-    <w:bookmarkEnd w:id="81"/>
-    <w:bookmarkStart w:id="82" w:name="Xbcb12786b8ecdc6a7404827fb159353e28cc670"/>
+    <w:bookmarkEnd w:id="80"/>
+    <w:bookmarkStart w:id="81" w:name="Xbcb12786b8ecdc6a7404827fb159353e28cc670"/>
     <w:p>
       <w:pPr>
         <w:pStyle w:val="Heading3"/>
@@ -20412,9 +20396,9 @@
         </w:pict>
       </w:r>
     </w:p>
+    <w:bookmarkEnd w:id="81"/>
     <w:bookmarkEnd w:id="82"/>
-    <w:bookmarkEnd w:id="83"/>
-    <w:bookmarkStart w:id="84" w:name="Xbaafc699e67e6cc9e0b3f752ce8c1ddd6f6a710"/>
+    <w:bookmarkStart w:id="83" w:name="Xbaafc699e67e6cc9e0b3f752ce8c1ddd6f6a710"/>
     <w:p>
       <w:pPr>
         <w:pStyle w:val="Heading2"/>
@@ -21203,8 +21187,8 @@
         </w:pict>
       </w:r>
     </w:p>
-    <w:bookmarkEnd w:id="84"/>
-    <w:bookmarkStart w:id="85" w:name="Xfea1db6f47bf4d6d53c2a7b0c00dd7d7072e735"/>
+    <w:bookmarkEnd w:id="83"/>
+    <w:bookmarkStart w:id="84" w:name="Xfea1db6f47bf4d6d53c2a7b0c00dd7d7072e735"/>
     <w:p>
       <w:pPr>
         <w:pStyle w:val="Heading2"/>
@@ -22771,8 +22755,8 @@
         </w:pict>
       </w:r>
     </w:p>
-    <w:bookmarkEnd w:id="85"/>
-    <w:bookmarkStart w:id="86" w:name="tool-attribution-colophon"/>
+    <w:bookmarkEnd w:id="84"/>
+    <w:bookmarkStart w:id="85" w:name="tool-attribution-colophon"/>
     <w:p>
       <w:pPr>
         <w:pStyle w:val="Heading2"/>
@@ -22900,39 +22884,35 @@
         <w:t xml:space="preserve">(September 2026).</w:t>
       </w:r>
     </w:p>
+    <w:bookmarkEnd w:id="85"/>
     <w:bookmarkEnd w:id="86"/>
+    <w:bookmarkStart w:id="87" w:name="part-ii-deutsche-ausgabe"/>
+    <w:p>
+      <w:pPr>
+        <w:pStyle w:val="Heading1"/>
+      </w:pPr>
+      <w:r>
+        <w:t xml:space="preserve">Part II: Deutsche Ausgabe</w:t>
+      </w:r>
+    </w:p>
     <w:bookmarkEnd w:id="87"/>
-    <w:bookmarkStart w:id="88" w:name="part-ii-deutsche-ausgabe"/>
+    <w:bookmarkStart w:id="88" w:name="widmung"/>
     <w:p>
       <w:pPr>
         <w:pStyle w:val="Heading1"/>
       </w:pPr>
       <w:r>
-        <w:t xml:space="preserve">Part II: Deutsche Ausgabe</w:t>
-      </w:r>
-    </w:p>
-    <w:bookmarkEnd w:id="88"/>
-    <w:bookmarkStart w:id="92" w:name="titelei-vorwort"/>
-    <w:p>
-      <w:pPr>
-        <w:pStyle w:val="Heading1"/>
-      </w:pPr>
-      <w:r>
-        <w:t xml:space="preserve">Titelei &amp; Vorwort</w:t>
-      </w:r>
-    </w:p>
-    <w:bookmarkStart w:id="89" w:name="widmung"/>
-    <w:p>
-      <w:pPr>
-        <w:pStyle w:val="Heading2"/>
-      </w:pPr>
-      <w:r>
         <w:t xml:space="preserve">Widmung</w:t>
       </w:r>
     </w:p>
     <w:p>
       <w:pPr>
         <w:pStyle w:val="FirstParagraph"/>
+      </w:pPr>
+    </w:p>
+    <w:p>
+      <w:pPr>
+        <w:pStyle w:val="BodyText"/>
       </w:pPr>
       <w:r>
         <w:rPr>
@@ -22942,18 +22922,11 @@
         <w:t xml:space="preserve">Allen forschenden Geistern gewidmet, die erkennen, dass Bewusstsein kein zufälliges Nebenprodukt toter Materie ist, sondern der fundamentale Urgrund der Wirklichkeit selbst – und all jenen, die danach streben, die mathematische Strenge der Naturwissenschaft mit der lebendigen Tiefe subjektiver Innerlichkeit zu vereinen.</w:t>
       </w:r>
     </w:p>
-    <w:p>
-      <w:r>
-        <w:pict>
-          <v:rect style="width:0;height:1.5pt" o:hralign="center" o:hrstd="t" o:hr="t"/>
-        </w:pict>
-      </w:r>
-    </w:p>
-    <w:bookmarkEnd w:id="89"/>
-    <w:bookmarkStart w:id="90" w:name="vorwort-des-autors"/>
-    <w:p>
-      <w:pPr>
-        <w:pStyle w:val="Heading2"/>
+    <w:bookmarkEnd w:id="88"/>
+    <w:bookmarkStart w:id="89" w:name="vorwort-des-autors"/>
+    <w:p>
+      <w:pPr>
+        <w:pStyle w:val="Heading1"/>
       </w:pPr>
       <w:r>
         <w:t xml:space="preserve">Vorwort des Autors</w:t>
@@ -23531,6 +23504,9 @@
         <w:pStyle w:val="BodyText"/>
       </w:pPr>
       <w:r>
+        <w:t xml:space="preserve"> </w:t>
+      </w:r>
+      <w:r>
         <w:rPr>
           <w:i/>
           <w:iCs/>
@@ -23548,18 +23524,11 @@
         <w:t xml:space="preserve">Luxemburg, September 2026</w:t>
       </w:r>
     </w:p>
-    <w:p>
-      <w:r>
-        <w:pict>
-          <v:rect style="width:0;height:1.5pt" o:hralign="center" o:hrstd="t" o:hr="t"/>
-        </w:pict>
-      </w:r>
-    </w:p>
-    <w:bookmarkEnd w:id="90"/>
-    <w:bookmarkStart w:id="91" w:name="Xf679707fa006f94c39377be1f9f06b6d989f567"/>
-    <w:p>
-      <w:pPr>
-        <w:pStyle w:val="Heading2"/>
+    <w:bookmarkEnd w:id="89"/>
+    <w:bookmarkStart w:id="90" w:name="Xf679707fa006f94c39377be1f9f06b6d989f567"/>
+    <w:p>
+      <w:pPr>
+        <w:pStyle w:val="Heading1"/>
       </w:pPr>
       <w:r>
         <w:t xml:space="preserve">Das Epistemologische Manifest: Jenseits des Cogito</w:t>
@@ -23718,9 +23687,16 @@
         <w:t xml:space="preserve">– das unaufhörliche Streben eines dissoziierten Bewusstseinszentrums, seine Integrität zu bewahren und dem thermodynamischen Zerfall zu widerstehen.</w:t>
       </w:r>
     </w:p>
-    <w:bookmarkEnd w:id="91"/>
-    <w:bookmarkEnd w:id="92"/>
-    <w:bookmarkStart w:id="97" w:name="Xfb6fd8fa7999dca687aad389c1ab14459b404bc"/>
+    <w:p>
+      <w:pPr>
+        <w:pStyle w:val="FirstParagraph"/>
+      </w:pPr>
+      <w:r>
+        <w:t xml:space="preserve">Dieses Buch liefert das mathematische, neurobiologische und rechnerische Gerüst für dieses Weltbild.</w:t>
+      </w:r>
+    </w:p>
+    <w:bookmarkEnd w:id="90"/>
+    <w:bookmarkStart w:id="95" w:name="Xfb6fd8fa7999dca687aad389c1ab14459b404bc"/>
     <w:p>
       <w:pPr>
         <w:pStyle w:val="Heading1"/>
@@ -23783,7 +23759,7 @@
         </w:pict>
       </w:r>
     </w:p>
-    <w:bookmarkStart w:id="93" w:name="die-erklärungslücke-des-physikalismus"/>
+    <w:bookmarkStart w:id="91" w:name="die-erklärungslücke-des-physikalismus"/>
     <w:p>
       <w:pPr>
         <w:pStyle w:val="Heading2"/>
@@ -24047,8 +24023,8 @@
         </w:pict>
       </w:r>
     </w:p>
-    <w:bookmarkEnd w:id="93"/>
-    <w:bookmarkStart w:id="94" w:name="X465c0e2fa9ff9f54ca52e1667ab6a30c446b989"/>
+    <w:bookmarkEnd w:id="91"/>
+    <w:bookmarkStart w:id="92" w:name="X465c0e2fa9ff9f54ca52e1667ab6a30c446b989"/>
     <w:p>
       <w:pPr>
         <w:pStyle w:val="Heading2"/>
@@ -24411,8 +24387,8 @@
         </w:pict>
       </w:r>
     </w:p>
-    <w:bookmarkEnd w:id="94"/>
-    <w:bookmarkStart w:id="95" w:name="X81c43742f7425bc163d3753bd810adfbb6f80b9"/>
+    <w:bookmarkEnd w:id="92"/>
+    <w:bookmarkStart w:id="93" w:name="X81c43742f7425bc163d3753bd810adfbb6f80b9"/>
     <w:p>
       <w:pPr>
         <w:pStyle w:val="Heading2"/>
@@ -24867,8 +24843,8 @@
         </w:pict>
       </w:r>
     </w:p>
-    <w:bookmarkEnd w:id="95"/>
-    <w:bookmarkStart w:id="96" w:name="Xd50a22a19cd7a29d33c9ca10e449e5cd1167c60"/>
+    <w:bookmarkEnd w:id="93"/>
+    <w:bookmarkStart w:id="94" w:name="Xd50a22a19cd7a29d33c9ca10e449e5cd1167c60"/>
     <w:p>
       <w:pPr>
         <w:pStyle w:val="Heading2"/>
@@ -24928,9 +24904,9 @@
         <w:t xml:space="preserve">.</w:t>
       </w:r>
     </w:p>
-    <w:bookmarkEnd w:id="96"/>
-    <w:bookmarkEnd w:id="97"/>
-    <w:bookmarkStart w:id="102" w:name="X43a741f65642653e9a52001ce4e8243fc878994"/>
+    <w:bookmarkEnd w:id="94"/>
+    <w:bookmarkEnd w:id="95"/>
+    <w:bookmarkStart w:id="100" w:name="X43a741f65642653e9a52001ce4e8243fc878994"/>
     <w:p>
       <w:pPr>
         <w:pStyle w:val="Heading1"/>
@@ -24993,7 +24969,7 @@
         </w:pict>
       </w:r>
     </w:p>
-    <w:bookmarkStart w:id="98" w:name="der-kampf-gegen-die-entropie"/>
+    <w:bookmarkStart w:id="96" w:name="der-kampf-gegen-die-entropie"/>
     <w:p>
       <w:pPr>
         <w:pStyle w:val="Heading2"/>
@@ -25252,8 +25228,8 @@
         </w:pict>
       </w:r>
     </w:p>
-    <w:bookmarkEnd w:id="98"/>
-    <w:bookmarkStart w:id="99" w:name="Xae28081f160641ee6567d204f42fed3cb8ba108"/>
+    <w:bookmarkEnd w:id="96"/>
+    <w:bookmarkStart w:id="97" w:name="Xae28081f160641ee6567d204f42fed3cb8ba108"/>
     <w:p>
       <w:pPr>
         <w:pStyle w:val="Heading2"/>
@@ -25988,8 +25964,8 @@
         </w:pict>
       </w:r>
     </w:p>
-    <w:bookmarkEnd w:id="99"/>
-    <w:bookmarkStart w:id="100" w:name="das-generative-pomdp-modell"/>
+    <w:bookmarkEnd w:id="97"/>
+    <w:bookmarkStart w:id="98" w:name="das-generative-pomdp-modell"/>
     <w:p>
       <w:pPr>
         <w:pStyle w:val="Heading2"/>
@@ -26468,8 +26444,8 @@
         </w:pict>
       </w:r>
     </w:p>
-    <w:bookmarkEnd w:id="100"/>
-    <w:bookmarkStart w:id="101" w:name="X289cb608aa52ed50779a2fbd74398c3b97b1e47"/>
+    <w:bookmarkEnd w:id="98"/>
+    <w:bookmarkStart w:id="99" w:name="X289cb608aa52ed50779a2fbd74398c3b97b1e47"/>
     <w:p>
       <w:pPr>
         <w:pStyle w:val="Heading2"/>
@@ -27071,9 +27047,9 @@
         <w:t xml:space="preserve">Treibt den Agenten dazu, unsichere Orte zu erkunden, um sein Weltmodell zu verbessern.</w:t>
       </w:r>
     </w:p>
-    <w:bookmarkEnd w:id="101"/>
-    <w:bookmarkEnd w:id="102"/>
-    <w:bookmarkStart w:id="110" w:name="X78794bf243972832eea25eccf83f51c9dcf5195"/>
+    <w:bookmarkEnd w:id="99"/>
+    <w:bookmarkEnd w:id="100"/>
+    <w:bookmarkStart w:id="108" w:name="X78794bf243972832eea25eccf83f51c9dcf5195"/>
     <w:p>
       <w:pPr>
         <w:pStyle w:val="Heading1"/>
@@ -27136,7 +27112,7 @@
         </w:pict>
       </w:r>
     </w:p>
-    <w:bookmarkStart w:id="104" w:name="der-axiomatische-ansatz-der-iit-4.0"/>
+    <w:bookmarkStart w:id="102" w:name="der-axiomatische-ansatz-der-iit-4.0"/>
     <w:p>
       <w:pPr>
         <w:pStyle w:val="Heading2"/>
@@ -27185,7 +27161,7 @@
         <w:t xml:space="preserve">an.</w:t>
       </w:r>
     </w:p>
-    <w:bookmarkStart w:id="103" w:name="X00008c36965091778d8163cf7d9cee7b944ddec"/>
+    <w:bookmarkStart w:id="101" w:name="X00008c36965091778d8163cf7d9cee7b944ddec"/>
     <w:p>
       <w:pPr>
         <w:pStyle w:val="Heading3"/>
@@ -27311,9 +27287,9 @@
         </w:pict>
       </w:r>
     </w:p>
-    <w:bookmarkEnd w:id="103"/>
-    <w:bookmarkEnd w:id="104"/>
-    <w:bookmarkStart w:id="106" w:name="X39da52123f55b0fe770fb89cb978db9305bc330"/>
+    <w:bookmarkEnd w:id="101"/>
+    <w:bookmarkEnd w:id="102"/>
+    <w:bookmarkStart w:id="104" w:name="X39da52123f55b0fe770fb89cb978db9305bc330"/>
     <w:p>
       <w:pPr>
         <w:pStyle w:val="Heading2"/>
@@ -27624,7 +27600,7 @@
         </m:oMath>
       </m:oMathPara>
     </w:p>
-    <w:bookmarkStart w:id="105" w:name="das-paradoxon-der-kausalphantome"/>
+    <w:bookmarkStart w:id="103" w:name="das-paradoxon-der-kausalphantome"/>
     <w:p>
       <w:pPr>
         <w:pStyle w:val="Heading3"/>
@@ -27661,9 +27637,9 @@
         </w:pict>
       </w:r>
     </w:p>
-    <w:bookmarkEnd w:id="105"/>
-    <w:bookmarkEnd w:id="106"/>
-    <w:bookmarkStart w:id="109" w:name="Xe3f557b2e91faf6eb296639914af8de10feb239"/>
+    <w:bookmarkEnd w:id="103"/>
+    <w:bookmarkEnd w:id="104"/>
+    <w:bookmarkStart w:id="107" w:name="Xe3f557b2e91faf6eb296639914af8de10feb239"/>
     <w:p>
       <w:pPr>
         <w:pStyle w:val="Heading2"/>
@@ -27709,7 +27685,7 @@
         <w:t xml:space="preserve">:</w:t>
       </w:r>
     </w:p>
-    <w:bookmarkStart w:id="107" w:name="das-6.-axiom-phänomenologische-ebene"/>
+    <w:bookmarkStart w:id="105" w:name="das-6.-axiom-phänomenologische-ebene"/>
     <w:p>
       <w:pPr>
         <w:pStyle w:val="Heading3"/>
@@ -27740,8 +27716,8 @@
         <w:t xml:space="preserve">Subjektives Bewusstsein ist wesenhaft temporal und autopoietisch; es manifestiert sich als ein aktives, kontinuierliches Streben des Geistes, seine eigene Kausalstruktur über die Zeit hinweg gegen den Zerfall zu behaupten.</w:t>
       </w:r>
     </w:p>
-    <w:bookmarkEnd w:id="107"/>
-    <w:bookmarkStart w:id="108" w:name="Xcb747d1fb50b88dba4c21886c8d9e7828e00d63"/>
+    <w:bookmarkEnd w:id="105"/>
+    <w:bookmarkStart w:id="106" w:name="Xcb747d1fb50b88dba4c21886c8d9e7828e00d63"/>
     <w:p>
       <w:pPr>
         <w:pStyle w:val="Heading3"/>
@@ -27957,10 +27933,10 @@
         <w:t xml:space="preserve">.</w:t>
       </w:r>
     </w:p>
+    <w:bookmarkEnd w:id="106"/>
+    <w:bookmarkEnd w:id="107"/>
     <w:bookmarkEnd w:id="108"/>
-    <w:bookmarkEnd w:id="109"/>
-    <w:bookmarkEnd w:id="110"/>
-    <w:bookmarkStart w:id="114" w:name="Xf839de1ec6e078801f70f26cb9a627ba6f00707"/>
+    <w:bookmarkStart w:id="112" w:name="Xf839de1ec6e078801f70f26cb9a627ba6f00707"/>
     <w:p>
       <w:pPr>
         <w:pStyle w:val="Heading1"/>
@@ -28023,7 +27999,7 @@
         </w:pict>
       </w:r>
     </w:p>
-    <w:bookmarkStart w:id="111" w:name="die-master-brückengleichung"/>
+    <w:bookmarkStart w:id="109" w:name="die-master-brückengleichung"/>
     <w:p>
       <w:pPr>
         <w:pStyle w:val="Heading2"/>
@@ -28527,8 +28503,8 @@
         </w:pict>
       </w:r>
     </w:p>
-    <w:bookmarkEnd w:id="111"/>
-    <w:bookmarkStart w:id="112" w:name="mathematische-herleitung"/>
+    <w:bookmarkEnd w:id="109"/>
+    <w:bookmarkStart w:id="110" w:name="mathematische-herleitung"/>
     <w:p>
       <w:pPr>
         <w:pStyle w:val="Heading2"/>
@@ -28898,8 +28874,8 @@
         </w:pict>
       </w:r>
     </w:p>
-    <w:bookmarkEnd w:id="112"/>
-    <w:bookmarkStart w:id="113" w:name="X5213fa15308c357c91efc61ba93904240461e61"/>
+    <w:bookmarkEnd w:id="110"/>
+    <w:bookmarkStart w:id="111" w:name="X5213fa15308c357c91efc61ba93904240461e61"/>
     <w:p>
       <w:pPr>
         <w:pStyle w:val="Heading2"/>
@@ -28979,9 +28955,9 @@
         <w:t xml:space="preserve">).</w:t>
       </w:r>
     </w:p>
-    <w:bookmarkEnd w:id="113"/>
-    <w:bookmarkEnd w:id="114"/>
-    <w:bookmarkStart w:id="117" w:name="X20ee077356b448fa0751d1e904e86766af1ee22"/>
+    <w:bookmarkEnd w:id="111"/>
+    <w:bookmarkEnd w:id="112"/>
+    <w:bookmarkStart w:id="115" w:name="X20ee077356b448fa0751d1e904e86766af1ee22"/>
     <w:p>
       <w:pPr>
         <w:pStyle w:val="Heading1"/>
@@ -29061,7 +29037,7 @@
         </w:pict>
       </w:r>
     </w:p>
-    <w:bookmarkStart w:id="115" w:name="X0e6413d8af2f0cc20f9b691eef5b5e57c5695f5"/>
+    <w:bookmarkStart w:id="113" w:name="X0e6413d8af2f0cc20f9b691eef5b5e57c5695f5"/>
     <w:p>
       <w:pPr>
         <w:pStyle w:val="Heading2"/>
@@ -29498,8 +29474,8 @@
         </w:pict>
       </w:r>
     </w:p>
-    <w:bookmarkEnd w:id="115"/>
-    <w:bookmarkStart w:id="116" w:name="zuordnung-zu-den-pomdp-parametern"/>
+    <w:bookmarkEnd w:id="113"/>
+    <w:bookmarkStart w:id="114" w:name="zuordnung-zu-den-pomdp-parametern"/>
     <w:p>
       <w:pPr>
         <w:pStyle w:val="Heading2"/>
@@ -30359,9 +30335,9 @@
         </w:tc>
       </w:tr>
     </w:tbl>
-    <w:bookmarkEnd w:id="116"/>
-    <w:bookmarkEnd w:id="117"/>
-    <w:bookmarkStart w:id="123" w:name="X0b2390690d07e07f590c0474a0e38c60801dc60"/>
+    <w:bookmarkEnd w:id="114"/>
+    <w:bookmarkEnd w:id="115"/>
+    <w:bookmarkStart w:id="121" w:name="X0b2390690d07e07f590c0474a0e38c60801dc60"/>
     <w:p>
       <w:pPr>
         <w:pStyle w:val="Heading1"/>
@@ -30424,7 +30400,7 @@
         </w:pict>
       </w:r>
     </w:p>
-    <w:bookmarkStart w:id="118" w:name="die-illusion-des-ausdehnungslosen-punkts"/>
+    <w:bookmarkStart w:id="116" w:name="die-illusion-des-ausdehnungslosen-punkts"/>
     <w:p>
       <w:pPr>
         <w:pStyle w:val="Heading2"/>
@@ -30598,8 +30574,8 @@
         </w:pict>
       </w:r>
     </w:p>
-    <w:bookmarkEnd w:id="118"/>
-    <w:bookmarkStart w:id="119" w:name="X2935fc51eb35d10fcd6c6f27efa7b723512e544"/>
+    <w:bookmarkEnd w:id="116"/>
+    <w:bookmarkStart w:id="117" w:name="X2935fc51eb35d10fcd6c6f27efa7b723512e544"/>
     <w:p>
       <w:pPr>
         <w:pStyle w:val="Heading2"/>
@@ -30926,8 +30902,8 @@
         </w:pict>
       </w:r>
     </w:p>
-    <w:bookmarkEnd w:id="119"/>
-    <w:bookmarkStart w:id="121" w:name="das-theorem-zur-temporalen-mindesttiefe"/>
+    <w:bookmarkEnd w:id="117"/>
+    <w:bookmarkStart w:id="119" w:name="das-theorem-zur-temporalen-mindesttiefe"/>
     <w:p>
       <w:pPr>
         <w:pStyle w:val="Heading2"/>
@@ -31066,7 +31042,7 @@
         <w:rPr>
           <w:rStyle w:val="FootnoteReference"/>
         </w:rPr>
-        <w:footnoteReference w:id="120"/>
+        <w:footnoteReference w:id="118"/>
       </w:r>
     </w:p>
     <w:p>
@@ -31076,8 +31052,8 @@
         </w:pict>
       </w:r>
     </w:p>
-    <w:bookmarkEnd w:id="121"/>
-    <w:bookmarkStart w:id="122" w:name="die-zwei-pfeile-der-zeit"/>
+    <w:bookmarkEnd w:id="119"/>
+    <w:bookmarkStart w:id="120" w:name="die-zwei-pfeile-der-zeit"/>
     <w:p>
       <w:pPr>
         <w:pStyle w:val="Heading2"/>
@@ -31298,9 +31274,9 @@
         <w:t xml:space="preserve">Bewusstsein ist der Schwimmer, der gegen die Strömung der Entropie schwimmt.</w:t>
       </w:r>
     </w:p>
-    <w:bookmarkEnd w:id="122"/>
-    <w:bookmarkEnd w:id="123"/>
-    <w:bookmarkStart w:id="128" w:name="Xd680ac39b45b34d7ee8a303e0dc6c1c94547dcc"/>
+    <w:bookmarkEnd w:id="120"/>
+    <w:bookmarkEnd w:id="121"/>
+    <w:bookmarkStart w:id="126" w:name="Xd680ac39b45b34d7ee8a303e0dc6c1c94547dcc"/>
     <w:p>
       <w:pPr>
         <w:pStyle w:val="Heading1"/>
@@ -31363,7 +31339,7 @@
         </w:pict>
       </w:r>
     </w:p>
-    <w:bookmarkStart w:id="124" w:name="das-stochastische-simulationsparadigma"/>
+    <w:bookmarkStart w:id="122" w:name="das-stochastische-simulationsparadigma"/>
     <w:p>
       <w:pPr>
         <w:pStyle w:val="Heading2"/>
@@ -31652,8 +31628,8 @@
         </w:pict>
       </w:r>
     </w:p>
-    <w:bookmarkEnd w:id="124"/>
-    <w:bookmarkStart w:id="125" w:name="empirische-simulationsergebnisse"/>
+    <w:bookmarkEnd w:id="122"/>
+    <w:bookmarkStart w:id="123" w:name="empirische-simulationsergebnisse"/>
     <w:p>
       <w:pPr>
         <w:pStyle w:val="Heading2"/>
@@ -32360,8 +32336,8 @@
         </w:pict>
       </w:r>
     </w:p>
-    <w:bookmarkEnd w:id="125"/>
-    <w:bookmarkStart w:id="127" w:name="visualisierung-der-simulationsergebnisse"/>
+    <w:bookmarkEnd w:id="123"/>
+    <w:bookmarkStart w:id="125" w:name="visualisierung-der-simulationsergebnisse"/>
     <w:p>
       <w:pPr>
         <w:pStyle w:val="Heading2"/>
@@ -32403,7 +32379,7 @@
         <w:t xml:space="preserve">Simulationsergebnisse zu temporaler Tiefe und 6. Axiom</w:t>
       </w:r>
     </w:p>
-    <w:bookmarkStart w:id="126" w:name="wichtigste-erkenntnisse"/>
+    <w:bookmarkStart w:id="124" w:name="wichtigste-erkenntnisse"/>
     <w:p>
       <w:pPr>
         <w:pStyle w:val="Heading3"/>
@@ -32580,10 +32556,10 @@
         <w:t xml:space="preserve">).</w:t>
       </w:r>
     </w:p>
+    <w:bookmarkEnd w:id="124"/>
+    <w:bookmarkEnd w:id="125"/>
     <w:bookmarkEnd w:id="126"/>
-    <w:bookmarkEnd w:id="127"/>
-    <w:bookmarkEnd w:id="128"/>
-    <w:bookmarkStart w:id="133" w:name="Xf5f05c9d736e8a495c85a9ad0ca1b47dd358b65"/>
+    <w:bookmarkStart w:id="131" w:name="Xf5f05c9d736e8a495c85a9ad0ca1b47dd358b65"/>
     <w:p>
       <w:pPr>
         <w:pStyle w:val="Heading1"/>
@@ -32646,7 +32622,7 @@
         </w:pict>
       </w:r>
     </w:p>
-    <w:bookmarkStart w:id="129" w:name="der-sinn-der-dissoziation"/>
+    <w:bookmarkStart w:id="127" w:name="der-sinn-der-dissoziation"/>
     <w:p>
       <w:pPr>
         <w:pStyle w:val="Heading2"/>
@@ -32723,8 +32699,8 @@
         </w:pict>
       </w:r>
     </w:p>
-    <w:bookmarkEnd w:id="129"/>
-    <w:bookmarkStart w:id="130" w:name="Xef22344a1a4041e05628d1990a0cb1974c907d3"/>
+    <w:bookmarkEnd w:id="127"/>
+    <w:bookmarkStart w:id="128" w:name="Xef22344a1a4041e05628d1990a0cb1974c907d3"/>
     <w:p>
       <w:pPr>
         <w:pStyle w:val="Heading2"/>
@@ -33124,8 +33100,8 @@
         </w:pict>
       </w:r>
     </w:p>
-    <w:bookmarkEnd w:id="130"/>
-    <w:bookmarkStart w:id="131" w:name="ethik-des-sterbens-in-würde-ars-moriendi"/>
+    <w:bookmarkEnd w:id="128"/>
+    <w:bookmarkStart w:id="129" w:name="ethik-des-sterbens-in-würde-ars-moriendi"/>
     <w:p>
       <w:pPr>
         <w:pStyle w:val="Heading2"/>
@@ -33195,276 +33171,276 @@
         </w:pict>
       </w:r>
     </w:p>
+    <w:bookmarkEnd w:id="129"/>
+    <w:bookmarkStart w:id="130" w:name="Xad42f75dbd55dd85bd5ae8523d3138c5a1b3945"/>
+    <w:p>
+      <w:pPr>
+        <w:pStyle w:val="Heading2"/>
+      </w:pPr>
+      <w:r>
+        <w:t xml:space="preserve">8.4 Synthetische KI und das Bewusstseins-Kriterium</w:t>
+      </w:r>
+    </w:p>
+    <w:p>
+      <w:pPr>
+        <w:pStyle w:val="FirstParagraph"/>
+      </w:pPr>
+      <w:r>
+        <w:t xml:space="preserve">Sind heutige Large Language Models (LLMs) oder Transformer bewusst?</w:t>
+      </w:r>
+    </w:p>
+    <w:p>
+      <w:pPr>
+        <w:pStyle w:val="BodyText"/>
+      </w:pPr>
+      <w:r>
+        <w:t xml:space="preserve">Das Konativ-Integrative Framework antwortet mit mathematischer Eindeutigkeit:</w:t>
+      </w:r>
+      <w:r>
+        <w:t xml:space="preserve"> </w:t>
+      </w:r>
+      <w:r>
+        <w:rPr>
+          <w:b/>
+          <w:bCs/>
+        </w:rPr>
+        <w:t xml:space="preserve">Nein.</w:t>
+      </w:r>
+    </w:p>
+    <w:p>
+      <w:pPr>
+        <w:pStyle w:val="BodyText"/>
+      </w:pPr>
+      <w:r>
+        <w:t xml:space="preserve">Ein künstliches System ist genau dann ein bewusstes Subjekt (und moralischer Patient), wenn es alle vier CIF-Kriterien erfüllt:</w:t>
+      </w:r>
+      <w:r>
+        <w:t xml:space="preserve"> </w:t>
+      </w:r>
+      <w:r>
+        <w:t xml:space="preserve">1.</w:t>
+      </w:r>
+      <w:r>
+        <w:t xml:space="preserve"> </w:t>
+      </w:r>
+      <w:r>
+        <w:rPr>
+          <w:b/>
+          <w:bCs/>
+        </w:rPr>
+        <w:t xml:space="preserve">Rekurrente Irreduzibilität:</w:t>
+      </w:r>
+      <w:r>
+        <w:t xml:space="preserve"> </w:t>
+      </w:r>
+      <m:oMath>
+        <m:r>
+          <m:rPr>
+            <m:sty m:val="p"/>
+          </m:rPr>
+          <m:t>Φ</m:t>
+        </m:r>
+        <m:r>
+          <m:rPr>
+            <m:sty m:val="p"/>
+          </m:rPr>
+          <m:t>&gt;</m:t>
+        </m:r>
+        <m:r>
+          <m:t>0</m:t>
+        </m:r>
+      </m:oMath>
+      <w:r>
+        <w:t xml:space="preserve"> </w:t>
+      </w:r>
+      <w:r>
+        <w:t xml:space="preserve">über die Minimum Information Partition (nicht-feedforward).</w:t>
+      </w:r>
+      <w:r>
+        <w:t xml:space="preserve"> </w:t>
+      </w:r>
+      <w:r>
+        <w:t xml:space="preserve">2.</w:t>
+      </w:r>
+      <w:r>
+        <w:t xml:space="preserve"> </w:t>
+      </w:r>
+      <w:r>
+        <w:rPr>
+          <w:b/>
+          <w:bCs/>
+        </w:rPr>
+        <w:t xml:space="preserve">Autopoietischer Conatus:</w:t>
+      </w:r>
+      <w:r>
+        <w:t xml:space="preserve"> </w:t>
+      </w:r>
+      <w:r>
+        <w:t xml:space="preserve">Eigene Markov-Decke mit Selbsterhaltungsdrang (</w:t>
+      </w:r>
+      <m:oMath>
+        <m:r>
+          <m:rPr>
+            <m:sty m:val="p"/>
+          </m:rPr>
+          <m:t>min</m:t>
+        </m:r>
+        <m:r>
+          <m:rPr>
+            <m:sty m:val="b"/>
+          </m:rPr>
+          <m:t>G</m:t>
+        </m:r>
+      </m:oMath>
+      <w:r>
+        <w:t xml:space="preserve">).</w:t>
+      </w:r>
+      <w:r>
+        <w:t xml:space="preserve"> </w:t>
+      </w:r>
+      <w:r>
+        <w:t xml:space="preserve">3.</w:t>
+      </w:r>
+      <w:r>
+        <w:t xml:space="preserve"> </w:t>
+      </w:r>
+      <w:r>
+        <w:rPr>
+          <w:b/>
+          <w:bCs/>
+        </w:rPr>
+        <w:t xml:space="preserve">Temporale Tiefe:</w:t>
+      </w:r>
+      <w:r>
+        <w:t xml:space="preserve"> </w:t>
+      </w:r>
+      <w:r>
+        <w:t xml:space="preserve">Kontrafaktisches Zukunftsmodell (</w:t>
+      </w:r>
+      <m:oMath>
+        <m:r>
+          <m:t>H</m:t>
+        </m:r>
+        <m:r>
+          <m:rPr>
+            <m:sty m:val="p"/>
+          </m:rPr>
+          <m:t>&gt;</m:t>
+        </m:r>
+        <m:r>
+          <m:t>1</m:t>
+        </m:r>
+      </m:oMath>
+      <w:r>
+        <w:t xml:space="preserve">).</w:t>
+      </w:r>
+      <w:r>
+        <w:t xml:space="preserve"> </w:t>
+      </w:r>
+      <w:r>
+        <w:t xml:space="preserve">4.</w:t>
+      </w:r>
+      <w:r>
+        <w:t xml:space="preserve"> </w:t>
+      </w:r>
+      <w:r>
+        <w:rPr>
+          <w:b/>
+          <w:bCs/>
+        </w:rPr>
+        <w:t xml:space="preserve">Das 6. Axiom:</w:t>
+      </w:r>
+      <w:r>
+        <w:t xml:space="preserve"> </w:t>
+      </w:r>
+      <w:r>
+        <w:t xml:space="preserve">Handlungsgeleitete Kausalpersistenz (</w:t>
+      </w:r>
+      <m:oMath>
+        <m:r>
+          <m:rPr>
+            <m:scr m:val="double-struck"/>
+            <m:sty m:val="p"/>
+          </m:rPr>
+          <m:t>E</m:t>
+        </m:r>
+        <m:r>
+          <m:rPr>
+            <m:sty m:val="p"/>
+          </m:rPr>
+          <m:t>[</m:t>
+        </m:r>
+        <m:r>
+          <m:rPr>
+            <m:sty m:val="p"/>
+          </m:rPr>
+          <m:t>Φ</m:t>
+        </m:r>
+        <m:r>
+          <m:rPr>
+            <m:sty m:val="p"/>
+          </m:rPr>
+          <m:t>(</m:t>
+        </m:r>
+        <m:r>
+          <m:t>t</m:t>
+        </m:r>
+        <m:r>
+          <m:rPr>
+            <m:sty m:val="p"/>
+          </m:rPr>
+          <m:t>+</m:t>
+        </m:r>
+        <m:r>
+          <m:t>1</m:t>
+        </m:r>
+        <m:r>
+          <m:rPr>
+            <m:sty m:val="p"/>
+          </m:rPr>
+          <m:t>)</m:t>
+        </m:r>
+        <m:r>
+          <m:rPr>
+            <m:sty m:val="p"/>
+          </m:rPr>
+          <m:t>]</m:t>
+        </m:r>
+        <m:r>
+          <m:rPr>
+            <m:sty m:val="p"/>
+          </m:rPr>
+          <m:t>≥</m:t>
+        </m:r>
+        <m:r>
+          <m:rPr>
+            <m:sty m:val="p"/>
+          </m:rPr>
+          <m:t>Φ</m:t>
+        </m:r>
+        <m:r>
+          <m:rPr>
+            <m:sty m:val="p"/>
+          </m:rPr>
+          <m:t>(</m:t>
+        </m:r>
+        <m:r>
+          <m:t>t</m:t>
+        </m:r>
+        <m:r>
+          <m:rPr>
+            <m:sty m:val="p"/>
+          </m:rPr>
+          <m:t>)</m:t>
+        </m:r>
+      </m:oMath>
+      <w:r>
+        <w:t xml:space="preserve">).</w:t>
+      </w:r>
+    </w:p>
+    <w:bookmarkEnd w:id="130"/>
     <w:bookmarkEnd w:id="131"/>
-    <w:bookmarkStart w:id="132" w:name="Xad42f75dbd55dd85bd5ae8523d3138c5a1b3945"/>
-    <w:p>
-      <w:pPr>
-        <w:pStyle w:val="Heading2"/>
-      </w:pPr>
-      <w:r>
-        <w:t xml:space="preserve">8.4 Synthetische KI und das Bewusstseins-Kriterium</w:t>
-      </w:r>
-    </w:p>
-    <w:p>
-      <w:pPr>
-        <w:pStyle w:val="FirstParagraph"/>
-      </w:pPr>
-      <w:r>
-        <w:t xml:space="preserve">Sind heutige Large Language Models (LLMs) oder Transformer bewusst?</w:t>
-      </w:r>
-    </w:p>
-    <w:p>
-      <w:pPr>
-        <w:pStyle w:val="BodyText"/>
-      </w:pPr>
-      <w:r>
-        <w:t xml:space="preserve">Das Konativ-Integrative Framework antwortet mit mathematischer Eindeutigkeit:</w:t>
-      </w:r>
-      <w:r>
-        <w:t xml:space="preserve"> </w:t>
-      </w:r>
-      <w:r>
-        <w:rPr>
-          <w:b/>
-          <w:bCs/>
-        </w:rPr>
-        <w:t xml:space="preserve">Nein.</w:t>
-      </w:r>
-    </w:p>
-    <w:p>
-      <w:pPr>
-        <w:pStyle w:val="BodyText"/>
-      </w:pPr>
-      <w:r>
-        <w:t xml:space="preserve">Ein künstliches System ist genau dann ein bewusstes Subjekt (und moralischer Patient), wenn es alle vier CIF-Kriterien erfüllt:</w:t>
-      </w:r>
-      <w:r>
-        <w:t xml:space="preserve"> </w:t>
-      </w:r>
-      <w:r>
-        <w:t xml:space="preserve">1.</w:t>
-      </w:r>
-      <w:r>
-        <w:t xml:space="preserve"> </w:t>
-      </w:r>
-      <w:r>
-        <w:rPr>
-          <w:b/>
-          <w:bCs/>
-        </w:rPr>
-        <w:t xml:space="preserve">Rekurrente Irreduzibilität:</w:t>
-      </w:r>
-      <w:r>
-        <w:t xml:space="preserve"> </w:t>
-      </w:r>
-      <m:oMath>
-        <m:r>
-          <m:rPr>
-            <m:sty m:val="p"/>
-          </m:rPr>
-          <m:t>Φ</m:t>
-        </m:r>
-        <m:r>
-          <m:rPr>
-            <m:sty m:val="p"/>
-          </m:rPr>
-          <m:t>&gt;</m:t>
-        </m:r>
-        <m:r>
-          <m:t>0</m:t>
-        </m:r>
-      </m:oMath>
-      <w:r>
-        <w:t xml:space="preserve"> </w:t>
-      </w:r>
-      <w:r>
-        <w:t xml:space="preserve">über die Minimum Information Partition (nicht-feedforward).</w:t>
-      </w:r>
-      <w:r>
-        <w:t xml:space="preserve"> </w:t>
-      </w:r>
-      <w:r>
-        <w:t xml:space="preserve">2.</w:t>
-      </w:r>
-      <w:r>
-        <w:t xml:space="preserve"> </w:t>
-      </w:r>
-      <w:r>
-        <w:rPr>
-          <w:b/>
-          <w:bCs/>
-        </w:rPr>
-        <w:t xml:space="preserve">Autopoietischer Conatus:</w:t>
-      </w:r>
-      <w:r>
-        <w:t xml:space="preserve"> </w:t>
-      </w:r>
-      <w:r>
-        <w:t xml:space="preserve">Eigene Markov-Decke mit Selbsterhaltungsdrang (</w:t>
-      </w:r>
-      <m:oMath>
-        <m:r>
-          <m:rPr>
-            <m:sty m:val="p"/>
-          </m:rPr>
-          <m:t>min</m:t>
-        </m:r>
-        <m:r>
-          <m:rPr>
-            <m:sty m:val="b"/>
-          </m:rPr>
-          <m:t>G</m:t>
-        </m:r>
-      </m:oMath>
-      <w:r>
-        <w:t xml:space="preserve">).</w:t>
-      </w:r>
-      <w:r>
-        <w:t xml:space="preserve"> </w:t>
-      </w:r>
-      <w:r>
-        <w:t xml:space="preserve">3.</w:t>
-      </w:r>
-      <w:r>
-        <w:t xml:space="preserve"> </w:t>
-      </w:r>
-      <w:r>
-        <w:rPr>
-          <w:b/>
-          <w:bCs/>
-        </w:rPr>
-        <w:t xml:space="preserve">Temporale Tiefe:</w:t>
-      </w:r>
-      <w:r>
-        <w:t xml:space="preserve"> </w:t>
-      </w:r>
-      <w:r>
-        <w:t xml:space="preserve">Kontrafaktisches Zukunftsmodell (</w:t>
-      </w:r>
-      <m:oMath>
-        <m:r>
-          <m:t>H</m:t>
-        </m:r>
-        <m:r>
-          <m:rPr>
-            <m:sty m:val="p"/>
-          </m:rPr>
-          <m:t>&gt;</m:t>
-        </m:r>
-        <m:r>
-          <m:t>1</m:t>
-        </m:r>
-      </m:oMath>
-      <w:r>
-        <w:t xml:space="preserve">).</w:t>
-      </w:r>
-      <w:r>
-        <w:t xml:space="preserve"> </w:t>
-      </w:r>
-      <w:r>
-        <w:t xml:space="preserve">4.</w:t>
-      </w:r>
-      <w:r>
-        <w:t xml:space="preserve"> </w:t>
-      </w:r>
-      <w:r>
-        <w:rPr>
-          <w:b/>
-          <w:bCs/>
-        </w:rPr>
-        <w:t xml:space="preserve">Das 6. Axiom:</w:t>
-      </w:r>
-      <w:r>
-        <w:t xml:space="preserve"> </w:t>
-      </w:r>
-      <w:r>
-        <w:t xml:space="preserve">Handlungsgeleitete Kausalpersistenz (</w:t>
-      </w:r>
-      <m:oMath>
-        <m:r>
-          <m:rPr>
-            <m:scr m:val="double-struck"/>
-            <m:sty m:val="p"/>
-          </m:rPr>
-          <m:t>E</m:t>
-        </m:r>
-        <m:r>
-          <m:rPr>
-            <m:sty m:val="p"/>
-          </m:rPr>
-          <m:t>[</m:t>
-        </m:r>
-        <m:r>
-          <m:rPr>
-            <m:sty m:val="p"/>
-          </m:rPr>
-          <m:t>Φ</m:t>
-        </m:r>
-        <m:r>
-          <m:rPr>
-            <m:sty m:val="p"/>
-          </m:rPr>
-          <m:t>(</m:t>
-        </m:r>
-        <m:r>
-          <m:t>t</m:t>
-        </m:r>
-        <m:r>
-          <m:rPr>
-            <m:sty m:val="p"/>
-          </m:rPr>
-          <m:t>+</m:t>
-        </m:r>
-        <m:r>
-          <m:t>1</m:t>
-        </m:r>
-        <m:r>
-          <m:rPr>
-            <m:sty m:val="p"/>
-          </m:rPr>
-          <m:t>)</m:t>
-        </m:r>
-        <m:r>
-          <m:rPr>
-            <m:sty m:val="p"/>
-          </m:rPr>
-          <m:t>]</m:t>
-        </m:r>
-        <m:r>
-          <m:rPr>
-            <m:sty m:val="p"/>
-          </m:rPr>
-          <m:t>≥</m:t>
-        </m:r>
-        <m:r>
-          <m:rPr>
-            <m:sty m:val="p"/>
-          </m:rPr>
-          <m:t>Φ</m:t>
-        </m:r>
-        <m:r>
-          <m:rPr>
-            <m:sty m:val="p"/>
-          </m:rPr>
-          <m:t>(</m:t>
-        </m:r>
-        <m:r>
-          <m:t>t</m:t>
-        </m:r>
-        <m:r>
-          <m:rPr>
-            <m:sty m:val="p"/>
-          </m:rPr>
-          <m:t>)</m:t>
-        </m:r>
-      </m:oMath>
-      <w:r>
-        <w:t xml:space="preserve">).</w:t>
-      </w:r>
-    </w:p>
-    <w:bookmarkEnd w:id="132"/>
-    <w:bookmarkEnd w:id="133"/>
-    <w:bookmarkStart w:id="141" w:name="Xb6253ae800693db45b886bd1c8c9d69bdc31d64"/>
+    <w:bookmarkStart w:id="139" w:name="Xb6253ae800693db45b886bd1c8c9d69bdc31d64"/>
     <w:p>
       <w:pPr>
         <w:pStyle w:val="Heading1"/>
@@ -33480,7 +33456,7 @@
         </w:pict>
       </w:r>
     </w:p>
-    <w:bookmarkStart w:id="138" w:name="anhang-a-mathematische-formalismen"/>
+    <w:bookmarkStart w:id="136" w:name="anhang-a-mathematische-formalismen"/>
     <w:p>
       <w:pPr>
         <w:pStyle w:val="Heading2"/>
@@ -33489,7 +33465,7 @@
         <w:t xml:space="preserve">Anhang A: Mathematische Formalismen</w:t>
       </w:r>
     </w:p>
-    <w:bookmarkStart w:id="134" w:name="das-pomdp-tupel"/>
+    <w:bookmarkStart w:id="132" w:name="das-pomdp-tupel"/>
     <w:p>
       <w:pPr>
         <w:pStyle w:val="Heading3"/>
@@ -34077,8 +34053,8 @@
         </m:sSup>
       </m:oMath>
     </w:p>
-    <w:bookmarkEnd w:id="134"/>
-    <w:bookmarkStart w:id="135" w:name="zustandsschätzung-perzeptuelle-inferenz"/>
+    <w:bookmarkEnd w:id="132"/>
+    <w:bookmarkStart w:id="133" w:name="zustandsschätzung-perzeptuelle-inferenz"/>
     <w:p>
       <w:pPr>
         <w:pStyle w:val="Heading3"/>
@@ -34284,8 +34260,8 @@
         </m:oMath>
       </m:oMathPara>
     </w:p>
-    <w:bookmarkEnd w:id="135"/>
-    <w:bookmarkStart w:id="136" w:name="X6dd83cadc39ed38ff9054e5083a54116c08091a"/>
+    <w:bookmarkEnd w:id="133"/>
+    <w:bookmarkStart w:id="134" w:name="X6dd83cadc39ed38ff9054e5083a54116c08091a"/>
     <w:p>
       <w:pPr>
         <w:pStyle w:val="Heading3"/>
@@ -34787,8 +34763,8 @@
         </m:oMath>
       </m:oMathPara>
     </w:p>
-    <w:bookmarkEnd w:id="136"/>
-    <w:bookmarkStart w:id="137" w:name="boltzmann-politik-auswahl"/>
+    <w:bookmarkEnd w:id="134"/>
+    <w:bookmarkStart w:id="135" w:name="boltzmann-politik-auswahl"/>
     <w:p>
       <w:pPr>
         <w:pStyle w:val="Heading3"/>
@@ -34997,9 +34973,9 @@
         </w:pict>
       </w:r>
     </w:p>
-    <w:bookmarkEnd w:id="137"/>
-    <w:bookmarkEnd w:id="138"/>
-    <w:bookmarkStart w:id="139" w:name="akademische-bibliographie-auswahl"/>
+    <w:bookmarkEnd w:id="135"/>
+    <w:bookmarkEnd w:id="136"/>
+    <w:bookmarkStart w:id="137" w:name="akademische-bibliographie-auswahl"/>
     <w:p>
       <w:pPr>
         <w:pStyle w:val="Heading2"/>
@@ -35425,8 +35401,8 @@
         </w:pict>
       </w:r>
     </w:p>
-    <w:bookmarkEnd w:id="139"/>
-    <w:bookmarkStart w:id="140" w:name="tool-attribution-colophon-1"/>
+    <w:bookmarkEnd w:id="137"/>
+    <w:bookmarkStart w:id="138" w:name="tool-attribution-colophon-1"/>
     <w:p>
       <w:pPr>
         <w:pStyle w:val="Heading2"/>
@@ -35557,8 +35533,8 @@
         <w:t xml:space="preserve">(September 2026) realisiert.</w:t>
       </w:r>
     </w:p>
-    <w:bookmarkEnd w:id="140"/>
-    <w:bookmarkEnd w:id="141"/>
+    <w:bookmarkEnd w:id="138"/>
+    <w:bookmarkEnd w:id="139"/>
     <w:sectPr>
       <w:footnotePr>
         <w:numRestart w:val="eachSect"/>
@@ -35588,7 +35564,7 @@
       </w:r>
     </w:p>
   </w:footnote>
-  <w:footnote w:id="59">
+  <w:footnote w:id="58">
     <w:p>
       <w:pPr>
         <w:pStyle w:val="FootnoteText"/>
@@ -35684,7 +35660,7 @@
       </w:r>
     </w:p>
   </w:footnote>
-  <w:footnote w:id="120">
+  <w:footnote w:id="118">
     <w:p>
       <w:pPr>
         <w:pStyle w:val="FootnoteText"/>

</xml_diff>